<commit_message>
Draft_040: group frequent hedge forms by root in Results tally
suggest/suggests/suggesting (13), imply/implies/implying (3).
Potential kept at 19 lexical. Coding sheet unchanged.
</commit_message>
<xml_diff>
--- a/thesis/003_ThesisProposal_Draft_040.docx
+++ b/thesis/003_ThesisProposal_Draft_040.docx
@@ -5033,7 +5033,7 @@
           <w:szCs w:val="22"/>
           <w:rtl w:val="0"/>
         </w:rPr>
-        <w:t>Within the lexical hedge category, the token “potential” accounted for 19 of the 41 lexical instances (46.3%), the single most frequent hedge token in the corpus. Other frequent lexical forms included “suggests” (7), “suggest” (3), “suggesting” (3), and “indicating” (2). Modal verbs were led by “can” (6), “could” (6), “may” (6), and “might” (3). Concordance of the 19 potential instances shows recurring frames such as “the potential of X as a Y,” “has potential as an X,” and “highlight their potential as X.” That recurrence is notable; whether those uses express epistemic caution or topic-naming evaluation remains a boundary judgment under the Working Test and is open to alternative readings. Agriculture and Biology account for 15 of the 19 instances; Veterinary Medicine for 4.</w:t>
+        <w:t>Within the lexical hedge category, the token “potential” accounted for 19 of the 41 lexical instances (46.3%), the single most frequent hedge token in the corpus. Other frequent lexical forms, grouped by root, included “suggest / suggests / suggesting” (13), “imply / implies / implying” (3), and “indicating” (2). Modal verbs were led by “can” (6), “could” (6), “may” (6), and “might” (3). Concordance of the 19 potential instances shows recurring frames such as “the potential of X as a Y,” “has potential as an X,” and “highlight their potential as X.” That recurrence is notable. Whether those uses express epistemic caution or topic-naming evaluation remains a boundary judgment under the Working Test and is open to alternative readings. Agriculture and Biology account for 15 of the 19 instances. Veterinary Medicine accounts for 4.</w:t>
       </w:r>
       <w:r>
         <w:rPr>
@@ -8515,7 +8515,7 @@
           <w:szCs w:val="22"/>
           <w:rtl w:val="0"/>
         </w:rPr>
-        <w:t xml:space="preserve">Most hedges fall in implication and conclusion sentences rather than in direct results reporting. Forms such as potential and suggests/suggesting typically frame applications or interpretations, while results sentences more often use factive verbs (showed, revealed, demonstrated) without qualification. A formal move-structured count was not performed; this remains a qualitative pattern.</w:t>
+        <w:t>Most hedges fall in implication and conclusion sentences rather than in direct results reporting. Forms such as potential and suggest/suggests/suggesting typically frame applications or interpretations, while results sentences more often use factive verbs (showed, revealed, demonstrated) without qualification. A formal move-structured count was not performed. This remains a qualitative pattern.</w:t>
       </w:r>
       <w:r>
         <w:rPr>

</xml_diff>